<commit_message>
Replace [Yu Kyungho] placeholder with Yu Hyeong Won (분당서울대 외과·내분비외과)
- 39 files updated, 111 string replacements
- Senior co-corresponding author = Yu Hyeong Won (Department of Surgery, SNUBH)
- Fixed duplicate references after batch replacement
- Re-rendered manuscript v6 + cover letter v5 + outreach HTML/PDF/DOCX
- Rebuilt reviewer_bundle.zip with corrected names

Co-Authored-By: Claude Opus 4.7 (1M context) <noreply@anthropic.com>
</commit_message>
<xml_diff>
--- a/project/submission/npj/cover_letter_v5.docx
+++ b/project/submission/npj/cover_letter_v5.docx
@@ -988,7 +988,7 @@
         <w:t xml:space="preserve"> </w:t>
       </w:r>
       <w:r>
-        <w:t xml:space="preserve">Technology), in collaboration with [Yu Kyungho — full Korean/English</w:t>
+        <w:t xml:space="preserve">Technology), in collaboration with [Yu Hyeong Won — full Korean/English</w:t>
       </w:r>
       <w:r>
         <w:t xml:space="preserve"> </w:t>
@@ -1363,7 +1363,7 @@
         <w:pStyle w:val="BodyText"/>
       </w:pPr>
       <w:r>
-        <w:t xml:space="preserve">[Yu Kyungho — full name + email TBD by user] [Affiliation TBD],</w:t>
+        <w:t xml:space="preserve">[Yu Hyeong Won — full name + email TBD by user] [Affiliation TBD],</w:t>
       </w:r>
       <w:r>
         <w:t xml:space="preserve"> </w:t>

</xml_diff>